<commit_message>
Document the Tableau dashboards; update report, README, lineage and design
</commit_message>
<xml_diff>
--- a/docs/Project_Report.docx
+++ b/docs/Project_Report.docx
@@ -950,7 +950,7 @@
                 <w:sz w:val="20"/>
                 <w:szCs w:val="20"/>
               </w:rPr>
-              <w:t xml:space="preserve">23 reporting queries; a nine-page dashboard design with a tested data layer (the Power BI file itself is still to be built)</w:t>
+              <w:t>23 reporting queries; two Tableau dashboards with 10 sheets; a nine-page dashboard design with a tested data layer</w:t>
             </w:r>
           </w:p>
         </w:tc>
@@ -3217,7 +3217,7 @@
                 <w:sz w:val="18"/>
                 <w:szCs w:val="18"/>
               </w:rPr>
-              <w:t xml:space="preserve">SQL, Power BI</w:t>
+              <w:t>SQL, Tableau</w:t>
             </w:r>
           </w:p>
         </w:tc>
@@ -6055,6 +6055,71 @@
         <w:rPr>
           <w:rFonts w:ascii="Arial" w:cs="Arial" w:eastAsia="Arial" w:hAnsi="Arial"/>
         </w:rPr>
+        <w:t>Tableau dashboards</w:t>
+      </w:r>
+    </w:p>
+    <w:p>
+      <w:pPr>
+        <w:keepNext w:val="false"/>
+        <w:spacing w:after="140" w:line="276"/>
+      </w:pPr>
+      <w:r>
+        <w:rPr>
+          <w:rFonts w:ascii="Courier New" w:cs="Courier New" w:eastAsia="Courier New" w:hAnsi="Courier New"/>
+          <w:sz w:val="19"/>
+          <w:szCs w:val="19"/>
+        </w:rPr>
+        <w:t xml:space="preserve">dashboards/Dashboards.twbx</w:t>
+      </w:r>
+      <w:r>
+        <w:rPr>
+          <w:rFonts w:ascii="Arial" w:cs="Arial" w:eastAsia="Arial" w:hAnsi="Arial"/>
+          <w:sz w:val="21"/>
+          <w:szCs w:val="21"/>
+        </w:rPr>
+        <w:t xml:space="preserve"> is a Tableau workbook built on the exported dashboard data. It has 10 sheets on 2 dashboards: sales by category, warehouse demand, receivable delays, procurement cost, finance revenue, machine availability, inventory demand by month, salary by age group, credit limit by city, and asset condition. The Business Requirement Document named Power BI as the reporting tool, and the dashboards were built in Tableau instead. The same views and design also support a Power BI build (</w:t>
+      </w:r>
+      <w:r>
+        <w:rPr>
+          <w:rFonts w:ascii="Courier New" w:cs="Courier New" w:eastAsia="Courier New" w:hAnsi="Courier New"/>
+          <w:sz w:val="19"/>
+          <w:szCs w:val="19"/>
+        </w:rPr>
+        <w:t xml:space="preserve">dashboards/Power_BI_Build_Guide.md</w:t>
+      </w:r>
+      <w:r>
+        <w:rPr>
+          <w:rFonts w:ascii="Arial" w:cs="Arial" w:eastAsia="Arial" w:hAnsi="Arial"/>
+          <w:sz w:val="21"/>
+          <w:szCs w:val="21"/>
+        </w:rPr>
+        <w:t xml:space="preserve">). The category totals, the monthly demand and the city credit limits that we compared with the warehouse match. </w:t>
+      </w:r>
+      <w:r>
+        <w:rPr>
+          <w:rFonts w:ascii="Courier New" w:cs="Courier New" w:eastAsia="Courier New" w:hAnsi="Courier New"/>
+          <w:sz w:val="19"/>
+          <w:szCs w:val="19"/>
+        </w:rPr>
+        <w:t xml:space="preserve">dashboards/Tableau_Dashboard_Notes.md</w:t>
+      </w:r>
+      <w:r>
+        <w:rPr>
+          <w:rFonts w:ascii="Arial" w:cs="Arial" w:eastAsia="Arial" w:hAnsi="Arial"/>
+          <w:sz w:val="21"/>
+          <w:szCs w:val="21"/>
+        </w:rPr>
+        <w:t xml:space="preserve"> lists what each sheet shows and the improvements that are still open.</w:t>
+      </w:r>
+    </w:p>
+    <w:p>
+      <w:pPr>
+        <w:pStyle w:val="Heading3"/>
+      </w:pPr>
+      <w:r>
+        <w:rPr>
+          <w:rFonts w:ascii="Arial" w:cs="Arial" w:eastAsia="Arial" w:hAnsi="Arial"/>
+        </w:rPr>
         <w:t xml:space="preserve">Reproducibility</w:t>
       </w:r>
     </w:p>
@@ -13777,7 +13842,7 @@
           <w:sz w:val="21"/>
           <w:szCs w:val="21"/>
         </w:rPr>
-        <w:t xml:space="preserve">The Power BI file is not built yet.</w:t>
+        <w:t>The Tableau dashboards are simpler than the design.</w:t>
       </w:r>
       <w:r>
         <w:rPr>
@@ -13785,7 +13850,7 @@
           <w:sz w:val="21"/>
           <w:szCs w:val="21"/>
         </w:rPr>
-        <w:t xml:space="preserve"> The data layer, the views, the exported data and the nine-page design are done and tested. Power BI Desktop runs only on Windows, and the file will be built there.</w:t>
+        <w:t xml:space="preserve"> They have 10 sheets on 2 dashboards, without caveat text boxes or a data-trust page. Two sheets still need a correction: the procurement cost includes cancelled orders (Finding 11), and the asset condition score is added up instead of averaged. The delay days and the finance revenue are shown without their warnings (Findings 9 and 12).</w:t>
       </w:r>
     </w:p>
     <w:p>
@@ -13954,7 +14019,23 @@
           <w:sz w:val="21"/>
           <w:szCs w:val="21"/>
         </w:rPr>
-        <w:t xml:space="preserve">Build the Power BI dashboard from the CSV files and compare every card with the check values in the design document.</w:t>
+        <w:t xml:space="preserve">Improve the Tableau dashboards with the fixes in </w:t>
+      </w:r>
+      <w:r>
+        <w:rPr>
+          <w:rFonts w:ascii="Courier New" w:cs="Courier New" w:eastAsia="Courier New" w:hAnsi="Courier New"/>
+          <w:sz w:val="19"/>
+          <w:szCs w:val="19"/>
+        </w:rPr>
+        <w:t xml:space="preserve">dashboards/Tableau_Dashboard_Notes.md</w:t>
+      </w:r>
+      <w:r>
+        <w:rPr>
+          <w:rFonts w:ascii="Arial" w:cs="Arial" w:eastAsia="Arial" w:hAnsi="Arial"/>
+          <w:sz w:val="21"/>
+          <w:szCs w:val="21"/>
+        </w:rPr>
+        <w:t xml:space="preserve">: leave out cancelled orders, average the condition score, and add the caveat texts and a data-trust sheet.</w:t>
       </w:r>
     </w:p>
     <w:p>
@@ -14051,7 +14132,7 @@
           <w:sz w:val="21"/>
           <w:szCs w:val="21"/>
         </w:rPr>
-        <w:t xml:space="preserve">The project delivers what the Business Requirement Document asked for. Data from ten ERP datasets is collected, cleaned, validated and loaded into a PostgreSQL star-schema warehouse by one repeatable job, with an audit log, a mapping to the sources, metadata, a glossary, lineage documentation and a set of checks that prove the load is complete. The most valuable result is not only the warehouse but the evidence around it: every number can be traced to a source file, and every known problem of the source data is documented and monitored. The main limit is the data itself, which is synthetic and disconnected between modules. The remaining work is the Power BI build and the follow-up items in Section 9.</w:t>
+        <w:t>The project delivers what the Business Requirement Document asked for. Data from ten ERP datasets is collected, cleaned, validated and loaded into a PostgreSQL star-schema warehouse by one repeatable job, with an audit log, a mapping to the sources, metadata, a glossary, lineage documentation and a set of checks that prove the load is complete. The most valuable result is not only the warehouse but the evidence around it: every number can be traced to a source file, and every known problem of the source data is documented and monitored. The main limit is the data itself, which is synthetic and disconnected between modules. The remaining work is to bring the Tableau dashboards closer to the dashboard design, and the follow-up items in Section 9.</w:t>
       </w:r>
     </w:p>
     <w:p>
@@ -15713,7 +15794,7 @@
                 <w:sz w:val="18"/>
                 <w:szCs w:val="18"/>
               </w:rPr>
-              <w:t xml:space="preserve">Dashboard views, exported data and design</w:t>
+              <w:t>Dashboard views, exported data, design and Tableau dashboards</w:t>
             </w:r>
           </w:p>
         </w:tc>

</xml_diff>